<commit_message>
feat(leads): ciclo de vida completo (Clasificación, Resultado, Estado, conversión y seguimiento)
- Clasificación obligatoria al crear (Estándar/Calificado), sin valor por defecto
- Resultado independiente: Pendiente (inicial) → Próspero / No Próspero, editable por ejecutivos y admins
- Estado Activo/Inactivo separado del pipeline; 14 días en Pendiente → Inactivo automático (recordatorios día 10 y 13, banner in-app; arquitectura lista para correo)
- Reactivación automática al actualizar Resultado o mover el pipeline
- 'Convertir a Contacto' solo con Resultado=Próspero; reutiliza la cuenta asociada del lead (sin duplicar) vía executeLeadConversion existente
- Ficha muestra los 3 conceptos por separado + selector de Resultado
- Timeline registra creación, cambios de clasificación/resultado, conversión, inactivo, reactivación y ediciones
- Reutiliza addLeadTimeline, executeLeadConversion, nx-card/badges; sin tocar el modelo ni el pipeline existente
- Guía de Leads actualizada a v2.0
</commit_message>
<xml_diff>
--- a/docs/manuales/Guia_Leads.docx
+++ b/docs/manuales/Guia_Leads.docx
@@ -80,7 +80,7 @@
           <w:color w:val="56648F"/>
           <w:sz w:val="21"/>
         </w:rPr>
-        <w:t>Versión 1.1   ·   23/07/2026</w:t>
+        <w:t>Versión 2.0   ·   23/07/2026</w:t>
       </w:r>
     </w:p>
     <w:p/>
@@ -96,7 +96,7 @@
     </w:p>
     <w:p>
       <w:r>
-        <w:t>Permite registrar oportunidades entrantes (consultas de posibles interesados) para hacerles seguimiento y, si corresponde, convertirlas en contactos y operaciones.</w:t>
+        <w:t>Permite registrar oportunidades entrantes (consultas de posibles interesados) y seguir su ciclo comercial: desde su creación hasta la conversión en Contacto o su cierre. El lead maneja tres conceptos independientes: Clasificación (calidad al ingresar), Resultado (Pendiente/Próspero/No Próspero) y Estado (Activo/Inactivo).</w:t>
       </w:r>
     </w:p>
     <w:p/>
@@ -348,6 +348,39 @@
           <w:color w:val="00285A"/>
           <w:sz w:val="23"/>
         </w:rPr>
+        <w:t>Clasificación</w:t>
+      </w:r>
+    </w:p>
+    <w:p>
+      <w:r>
+        <w:rPr>
+          <w:b/>
+          <w:color w:val="1C54F4"/>
+          <w:sz w:val="21"/>
+        </w:rPr>
+        <w:t>Qué ingresar:</w:t>
+      </w:r>
+    </w:p>
+    <w:p>
+      <w:r>
+        <w:t>Obligatorio. Indicar la calidad del lead al ingresar: Estándar o Calificado. No tiene valor por defecto.</w:t>
+      </w:r>
+    </w:p>
+    <w:p>
+      <w:r>
+        <w:rPr>
+          <w:color w:val="C9D6F0"/>
+        </w:rPr>
+        <w:t>──────────────────────────────────────────────</w:t>
+      </w:r>
+    </w:p>
+    <w:p>
+      <w:r>
+        <w:rPr>
+          <w:b/>
+          <w:color w:val="00285A"/>
+          <w:sz w:val="23"/>
+        </w:rPr>
         <w:t>Origen</w:t>
       </w:r>
     </w:p>
@@ -498,6 +531,39 @@
         <w:t>Observaciones: superficie buscada, urgencia, detalles de la consulta.</w:t>
       </w:r>
     </w:p>
+    <w:p>
+      <w:r>
+        <w:rPr>
+          <w:color w:val="C9D6F0"/>
+        </w:rPr>
+        <w:t>──────────────────────────────────────────────</w:t>
+      </w:r>
+    </w:p>
+    <w:p>
+      <w:r>
+        <w:rPr>
+          <w:b/>
+          <w:color w:val="00285A"/>
+          <w:sz w:val="23"/>
+        </w:rPr>
+        <w:t>Resultado (en la ficha)</w:t>
+      </w:r>
+    </w:p>
+    <w:p>
+      <w:r>
+        <w:rPr>
+          <w:b/>
+          <w:color w:val="1C54F4"/>
+          <w:sz w:val="21"/>
+        </w:rPr>
+        <w:t>Qué ingresar:</w:t>
+      </w:r>
+    </w:p>
+    <w:p>
+      <w:r>
+        <w:t>Se crea como Pendiente. Luego se actualiza a Próspero o No Próspero. Cuando es Próspero aparece la acción "Convertir a Contacto"; No Próspero conserva el lead como registro histórico.</w:t>
+      </w:r>
+    </w:p>
     <w:p/>
     <w:p>
       <w:r>
@@ -522,7 +588,7 @@
         <w:pStyle w:val="ListBullet"/>
       </w:pPr>
       <w:r>
-        <w:t>Se crea el Lead y queda asignado al ejecutivo indicado.</w:t>
+        <w:t>Se crea el Lead con Resultado Pendiente y Estado Activo, asignado al ejecutivo indicado.</w:t>
       </w:r>
     </w:p>
     <w:p>
@@ -530,7 +596,7 @@
         <w:pStyle w:val="ListBullet"/>
       </w:pPr>
       <w:r>
-        <w:t>Aparece en el listado de Leads para hacerle seguimiento.</w:t>
+        <w:t>Si pasa 14 días en Pendiente sin resolución, el lead pasa automáticamente a Inactivo (con recordatorios previos en los días 10 y 13). No se elimina.</w:t>
       </w:r>
     </w:p>
     <w:p>
@@ -538,7 +604,15 @@
         <w:pStyle w:val="ListBullet"/>
       </w:pPr>
       <w:r>
-        <w:t>Puede editarse o convertirse en contacto más adelante.</w:t>
+        <w:t>Al actualizar el Resultado (u otra acción comercial), un lead Inactivo vuelve a Activo.</w:t>
+      </w:r>
+    </w:p>
+    <w:p>
+      <w:pPr>
+        <w:pStyle w:val="ListBullet"/>
+      </w:pPr>
+      <w:r>
+        <w:t>Con Resultado Próspero se puede convertir en Contacto reutilizando la cuenta asociada, sin duplicar información; el lead queda como registro histórico.</w:t>
       </w:r>
     </w:p>
     <w:sectPr>

</xml_diff>

<commit_message>
feat(leads): teléfono, email y link de origen opcionales al crear/editar
- Se quita la obligatoriedad de Teléfono, Email y Link de origen en el drawer y en la edición inline
- Validación de formato solo si el campo se completa (email válido, teléfono, URL http/https)
- Obligatorios: Nombre, Apellido, Origen, Ejecutivo y Clasificación
- Guía de Leads a v2.1
</commit_message>
<xml_diff>
--- a/docs/manuales/Guia_Leads.docx
+++ b/docs/manuales/Guia_Leads.docx
@@ -80,7 +80,7 @@
           <w:color w:val="56648F"/>
           <w:sz w:val="21"/>
         </w:rPr>
-        <w:t>Versión 2.0   ·   23/07/2026</w:t>
+        <w:t>Versión 2.1   ·   23/07/2026</w:t>
       </w:r>
     </w:p>
     <w:p/>
@@ -198,7 +198,7 @@
     </w:p>
     <w:p>
       <w:r>
-        <w:t>Correo electrónico de contacto.</w:t>
+        <w:t>Correo electrónico de contacto (opcional). Si se completa, debe tener formato válido.</w:t>
       </w:r>
     </w:p>
     <w:p>
@@ -231,7 +231,7 @@
     </w:p>
     <w:p>
       <w:r>
-        <w:t>Número de celular de la persona.</w:t>
+        <w:t>Número de celular de la persona (opcional). Se puede completar más adelante.</w:t>
       </w:r>
     </w:p>
     <w:p>
@@ -495,7 +495,7 @@
     </w:p>
     <w:p>
       <w:r>
-        <w:t>Pegar el enlace del aviso o publicación de donde surgió la consulta.</w:t>
+        <w:t>Pegar el enlace del aviso o publicación de donde surgió la consulta (opcional). Si se completa, debe ser una URL válida.</w:t>
       </w:r>
     </w:p>
     <w:p>

</xml_diff>

<commit_message>
feat(leads): agregar Cargo segmentado (mismo criterio que Contactos)
- Nuevo campo Cargo segmentado en el drawer de Lead con las mismas opciones que Contactos (CEO/CFO/Compras/Real Estate/Otro); 'Otro' sugiere especificar en Puesto
- Se guarda en el lead y se muestra en la ficha; edición inline incluida
- Conversión a Contacto: conserva Cargo segmentado y Puesto (antes forzaba 'Otro')
- Reutiliza el mismo criterio/opciones de Contactos; Puesto sigue disponible siempre
- Guía de Leads a v2.2
</commit_message>
<xml_diff>
--- a/docs/manuales/Guia_Leads.docx
+++ b/docs/manuales/Guia_Leads.docx
@@ -80,7 +80,7 @@
           <w:color w:val="56648F"/>
           <w:sz w:val="21"/>
         </w:rPr>
-        <w:t>Versión 2.1   ·   23/07/2026</w:t>
+        <w:t>Versión 2.2   ·   23/07/2026</w:t>
       </w:r>
     </w:p>
     <w:p/>
@@ -282,6 +282,39 @@
           <w:color w:val="00285A"/>
           <w:sz w:val="23"/>
         </w:rPr>
+        <w:t>Cargo segmentado</w:t>
+      </w:r>
+    </w:p>
+    <w:p>
+      <w:r>
+        <w:rPr>
+          <w:b/>
+          <w:color w:val="1C54F4"/>
+          <w:sz w:val="21"/>
+        </w:rPr>
+        <w:t>Qué ingresar:</w:t>
+      </w:r>
+    </w:p>
+    <w:p>
+      <w:r>
+        <w:t>Seleccionar el tipo de cargo (CEO, CFO, Compras, Real Estate u Otro), igual que en Contactos. Si se elige "Otro", especificar el cargo en el campo Puesto.</w:t>
+      </w:r>
+    </w:p>
+    <w:p>
+      <w:r>
+        <w:rPr>
+          <w:color w:val="C9D6F0"/>
+        </w:rPr>
+        <w:t>──────────────────────────────────────────────</w:t>
+      </w:r>
+    </w:p>
+    <w:p>
+      <w:r>
+        <w:rPr>
+          <w:b/>
+          <w:color w:val="00285A"/>
+          <w:sz w:val="23"/>
+        </w:rPr>
         <w:t>Puesto</w:t>
       </w:r>
     </w:p>
@@ -297,7 +330,7 @@
     </w:p>
     <w:p>
       <w:r>
-        <w:t>Puesto o rol de la persona (opcional).</w:t>
+        <w:t>Puesto o rol de la persona (opcional). Sirve para ampliar o especificar el cargo.</w:t>
       </w:r>
     </w:p>
     <w:p>

</xml_diff>

<commit_message>
feat(leads): renombrar 'Tipo de inmueble' a 'Tipo de consulta' con nuevas opciones y 'Otros'
- Campo renombrado a Tipo de consulta en drawer, edición, detalle y Timeline (misma ubicación, mismo campo de datos tipoInmueble)
- Nuevas opciones: Oficina, Industria, Depósito, Terreno, Retail, SPS, Valuaciones, Otros
- 'Otros' muestra un texto libre para especificar (tipoConsultaOtro); se oculta y limpia al elegir otra opción
- Lista única LEAD_TIPO_CONSULTA reutilizada en drawer y edición; guía de Leads a v2.3
</commit_message>
<xml_diff>
--- a/docs/manuales/Guia_Leads.docx
+++ b/docs/manuales/Guia_Leads.docx
@@ -80,7 +80,7 @@
           <w:color w:val="56648F"/>
           <w:sz w:val="21"/>
         </w:rPr>
-        <w:t>Versión 2.2   ·   23/07/2026</w:t>
+        <w:t>Versión 2.3   ·   23/07/2026</w:t>
       </w:r>
     </w:p>
     <w:p/>
@@ -348,7 +348,7 @@
           <w:color w:val="00285A"/>
           <w:sz w:val="23"/>
         </w:rPr>
-        <w:t>Tipo de inmueble</w:t>
+        <w:t>Tipo de consulta</w:t>
       </w:r>
     </w:p>
     <w:p>
@@ -363,7 +363,7 @@
     </w:p>
     <w:p>
       <w:r>
-        <w:t>Tipo de propiedad que busca (oficina, local, depósito, etc.).</w:t>
+        <w:t>Tipo de consulta realizada: Oficina, Industria, Depósito, Terreno, Retail, SPS, Valuaciones u Otros. Si se elige "Otros", aparece un campo para especificar la consulta.</w:t>
       </w:r>
     </w:p>
     <w:p>

</xml_diff>

<commit_message>
feat(leads): conversión con 3 opciones (cuenta existente / nueva cuenta / particular)
- Modal de conversión con opción 'Particular' (contacto sin cuenta, marcado esParticular)
- 'Crear nueva Cuenta' abre openClientDrawer (respeta permisos admin/ejecutivo) y al guardar vincula el contacto y completa la conversión
- Helper _finishLeadConversion reutilizado por las 3 opciones; navega a la ficha del contacto creado (_gotoContacto)
- Caso sin cuenta asociada: el modal ya ofrece las 3 opciones sin salir del flujo
- Timeline registra el destino y alta de contacto en la cuenta; 'existente' exige seleccionar cuenta
- Reutiliza openClientDrawer, addLeadTimeline, addClientTimeline, openContactoDetail; guía Leads v2.4
</commit_message>
<xml_diff>
--- a/docs/manuales/Guia_Leads.docx
+++ b/docs/manuales/Guia_Leads.docx
@@ -80,7 +80,7 @@
           <w:color w:val="56648F"/>
           <w:sz w:val="21"/>
         </w:rPr>
-        <w:t>Versión 2.3   ·   23/07/2026</w:t>
+        <w:t>Versión 2.4   ·   23/07/2026</w:t>
       </w:r>
     </w:p>
     <w:p/>
@@ -645,7 +645,7 @@
         <w:pStyle w:val="ListBullet"/>
       </w:pPr>
       <w:r>
-        <w:t>Con Resultado Próspero se puede convertir en Contacto reutilizando la cuenta asociada, sin duplicar información; el lead queda como registro histórico.</w:t>
+        <w:t>Con Resultado Próspero se puede convertir en Contacto. Al convertir se puede: vincular a una cuenta existente, crear una nueva cuenta (se abre el formulario según tu perfil y se vincula sola), o marcar el contacto como Particular (sin cuenta). Al finalizar se abre la ficha del contacto creado; el lead queda como registro histórico.</w:t>
       </w:r>
     </w:p>
     <w:sectPr>

</xml_diff>